<commit_message>
chore: prepare blueprint bundle for public release
</commit_message>
<xml_diff>
--- a/examples/sample_course__blueprint_bundle/sample_course__blueprint.docx
+++ b/examples/sample_course__blueprint_bundle/sample_course__blueprint.docx
@@ -18,7 +18,7 @@
           <w:color w:val="808080"/>
           <w:sz w:val="16"/>
         </w:rPr>
-        <w:t>Template format reference: Course Blueprint Template 2020 CGPS.docx  |  Evidence mode: extracted text is source-derived; missing fields remain marked for review.</w:t>
+        <w:t>Evidence mode: extracted text is source-derived; missing fields remain marked for review.</w:t>
       </w:r>
     </w:p>
     <w:p/>
@@ -72,12 +72,11 @@
             <w:tcW w:w="8640" w:type="dxa"/>
           </w:tcPr>
           <w:p>
+            <w:pPr>
+              <w:spacing w:before="0" w:after="120"/>
+            </w:pPr>
             <w:r>
-              <w:rPr>
-                <w:i/>
-                <w:color w:val="808080"/>
-              </w:rPr>
-              <w:t>Needs review: not found in export extraction.</w:t>
+              <w:t>This synthetic course helps reviewers inspect how Brightspace export evidence becomes a readable blueprint.</w:t>
             </w:r>
           </w:p>
         </w:tc>
@@ -134,12 +133,21 @@
             <w:tcW w:w="8640" w:type="dxa"/>
           </w:tcPr>
           <w:p>
+            <w:pPr>
+              <w:pStyle w:val="ListBullet"/>
+              <w:spacing w:before="0" w:after="40"/>
+            </w:pPr>
             <w:r>
-              <w:rPr>
-                <w:i/>
-                <w:color w:val="808080"/>
-              </w:rPr>
-              <w:t>Needs review: not found in export extraction.</w:t>
+              <w:t>Open readings linked from each weekly module.</w:t>
+            </w:r>
+          </w:p>
+          <w:p>
+            <w:pPr>
+              <w:pStyle w:val="ListBullet"/>
+              <w:spacing w:before="0" w:after="40"/>
+            </w:pPr>
+            <w:r>
+              <w:t>A planning worksheet supplied as a downloadable course file.</w:t>
             </w:r>
           </w:p>
         </w:tc>
@@ -196,12 +204,30 @@
             <w:tcW w:w="8640" w:type="dxa"/>
           </w:tcPr>
           <w:p>
+            <w:pPr>
+              <w:pStyle w:val="ListBullet"/>
+              <w:spacing w:before="0" w:after="40"/>
+            </w:pPr>
             <w:r>
-              <w:rPr>
-                <w:i/>
-                <w:color w:val="808080"/>
-              </w:rPr>
-              <w:t>Needs review: not found in export extraction.</w:t>
+              <w:t>Identify the structure of a Brightspace course export.</w:t>
+            </w:r>
+          </w:p>
+          <w:p>
+            <w:pPr>
+              <w:pStyle w:val="ListBullet"/>
+              <w:spacing w:before="0" w:after="40"/>
+            </w:pPr>
+            <w:r>
+              <w:t>Trace course objects from manifest placement to review output.</w:t>
+            </w:r>
+          </w:p>
+          <w:p>
+            <w:pPr>
+              <w:pStyle w:val="ListBullet"/>
+              <w:spacing w:before="0" w:after="40"/>
+            </w:pPr>
+            <w:r>
+              <w:t>Distinguish extracted evidence from missing or hidden content.</w:t>
             </w:r>
           </w:p>
         </w:tc>
@@ -217,14 +243,284 @@
       </w:r>
     </w:p>
     <w:p>
+      <w:pPr>
+        <w:spacing w:before="0" w:after="120"/>
+      </w:pPr>
       <w:r>
-        <w:rPr>
-          <w:i/>
-          <w:color w:val="808080"/>
-        </w:rPr>
-        <w:t>Needs review: not found in export extraction.</w:t>
+        <w:t>Welcome to the synthetic blueprint review course. This page demonstrates course-level introduction extraction.</w:t>
       </w:r>
     </w:p>
+    <w:p>
+      <w:pPr>
+        <w:pStyle w:val="Heading2"/>
+      </w:pPr>
+      <w:r>
+        <w:t>Before Week 1: Additional Resources and Information</w:t>
+      </w:r>
+    </w:p>
+    <w:tbl>
+      <w:tblPr>
+        <w:tblLayout w:type="fixed"/>
+        <w:tblLook w:firstColumn="1" w:firstRow="1" w:lastColumn="0" w:lastRow="0" w:noHBand="0" w:noVBand="1" w:val="04A0"/>
+        <w:tblBorders>
+          <w:top w:val="single" w:sz="4" w:space="0" w:color="808080"/>
+          <w:left w:val="single" w:sz="4" w:space="0" w:color="808080"/>
+          <w:bottom w:val="single" w:sz="4" w:space="0" w:color="808080"/>
+          <w:right w:val="single" w:sz="4" w:space="0" w:color="808080"/>
+          <w:insideH w:val="single" w:sz="4" w:space="0" w:color="808080"/>
+          <w:insideV w:val="single" w:sz="4" w:space="0" w:color="808080"/>
+        </w:tblBorders>
+        <w:tblW w:w="8640" w:type="dxa"/>
+        <w:tblInd w:w="0" w:type="dxa"/>
+        <w:tblCellMar>
+          <w:top w:w="60" w:type="dxa"/>
+          <w:start w:w="110" w:type="dxa"/>
+          <w:bottom w:w="60" w:type="dxa"/>
+          <w:end w:w="110" w:type="dxa"/>
+        </w:tblCellMar>
+      </w:tblPr>
+      <w:tblGrid>
+        <w:gridCol w:w="8640"/>
+      </w:tblGrid>
+      <w:tr>
+        <w:tc>
+          <w:tcPr>
+            <w:tcW w:w="8640" w:type="dxa"/>
+            <w:shd w:val="clear" w:color="auto" w:fill="F2F2F2"/>
+          </w:tcPr>
+          <w:p>
+            <w:pPr>
+              <w:spacing w:before="0" w:after="40"/>
+            </w:pPr>
+            <w:r>
+              <w:rPr>
+                <w:b/>
+                <w:sz w:val="18"/>
+              </w:rPr>
+              <w:t>Course Description</w:t>
+            </w:r>
+          </w:p>
+        </w:tc>
+      </w:tr>
+      <w:tr>
+        <w:tc>
+          <w:tcPr>
+            <w:tcW w:w="8640" w:type="dxa"/>
+          </w:tcPr>
+          <w:p>
+            <w:pPr>
+              <w:spacing w:before="0" w:after="120"/>
+            </w:pPr>
+            <w:r>
+              <w:t>This synthetic course helps reviewers inspect how Brightspace export evidence becomes a readable blueprint.</w:t>
+            </w:r>
+          </w:p>
+        </w:tc>
+      </w:tr>
+      <w:tr>
+        <w:tc>
+          <w:tcPr>
+            <w:tcW w:w="8640" w:type="dxa"/>
+            <w:shd w:val="clear" w:color="auto" w:fill="F2F2F2"/>
+          </w:tcPr>
+          <w:p>
+            <w:pPr>
+              <w:spacing w:before="0" w:after="40"/>
+            </w:pPr>
+            <w:r>
+              <w:rPr>
+                <w:b/>
+                <w:sz w:val="18"/>
+              </w:rPr>
+              <w:t>Course Materials</w:t>
+            </w:r>
+          </w:p>
+        </w:tc>
+      </w:tr>
+      <w:tr>
+        <w:tc>
+          <w:tcPr>
+            <w:tcW w:w="8640" w:type="dxa"/>
+          </w:tcPr>
+          <w:p>
+            <w:pPr>
+              <w:spacing w:before="160" w:after="40"/>
+            </w:pPr>
+            <w:r>
+              <w:rPr>
+                <w:b/>
+              </w:rPr>
+              <w:t>Required Materials:</w:t>
+            </w:r>
+          </w:p>
+          <w:p>
+            <w:pPr>
+              <w:pStyle w:val="ListBullet"/>
+              <w:spacing w:before="0" w:after="40"/>
+            </w:pPr>
+            <w:r>
+              <w:t>Open readings linked from each weekly module.</w:t>
+            </w:r>
+          </w:p>
+          <w:p>
+            <w:pPr>
+              <w:pStyle w:val="ListBullet"/>
+              <w:spacing w:before="0" w:after="40"/>
+            </w:pPr>
+            <w:r>
+              <w:t>A planning worksheet supplied as a downloadable course file.</w:t>
+            </w:r>
+          </w:p>
+        </w:tc>
+      </w:tr>
+      <w:tr>
+        <w:tc>
+          <w:tcPr>
+            <w:tcW w:w="8640" w:type="dxa"/>
+            <w:shd w:val="clear" w:color="auto" w:fill="F2F2F2"/>
+          </w:tcPr>
+          <w:p>
+            <w:pPr>
+              <w:spacing w:before="0" w:after="40"/>
+            </w:pPr>
+            <w:r>
+              <w:rPr>
+                <w:b/>
+                <w:sz w:val="18"/>
+              </w:rPr>
+              <w:t>Course Learning Outcomes</w:t>
+            </w:r>
+          </w:p>
+        </w:tc>
+      </w:tr>
+      <w:tr>
+        <w:tc>
+          <w:tcPr>
+            <w:tcW w:w="8640" w:type="dxa"/>
+          </w:tcPr>
+          <w:p>
+            <w:pPr>
+              <w:pStyle w:val="ListBullet"/>
+              <w:spacing w:before="0" w:after="40"/>
+            </w:pPr>
+            <w:r>
+              <w:t>Identify the structure of a Brightspace course export.</w:t>
+            </w:r>
+          </w:p>
+          <w:p>
+            <w:pPr>
+              <w:pStyle w:val="ListBullet"/>
+              <w:spacing w:before="0" w:after="40"/>
+            </w:pPr>
+            <w:r>
+              <w:t>Trace course objects from manifest placement to review output.</w:t>
+            </w:r>
+          </w:p>
+          <w:p>
+            <w:pPr>
+              <w:pStyle w:val="ListBullet"/>
+              <w:spacing w:before="0" w:after="40"/>
+            </w:pPr>
+            <w:r>
+              <w:t>Distinguish extracted evidence from missing or hidden content.</w:t>
+            </w:r>
+          </w:p>
+        </w:tc>
+      </w:tr>
+      <w:tr>
+        <w:tc>
+          <w:tcPr>
+            <w:tcW w:w="8640" w:type="dxa"/>
+            <w:shd w:val="clear" w:color="auto" w:fill="F2F2F2"/>
+          </w:tcPr>
+          <w:p>
+            <w:pPr>
+              <w:spacing w:before="0" w:after="40"/>
+            </w:pPr>
+            <w:r>
+              <w:rPr>
+                <w:b/>
+                <w:sz w:val="18"/>
+              </w:rPr>
+              <w:t>Project Roadmap and Setup</w:t>
+            </w:r>
+          </w:p>
+        </w:tc>
+      </w:tr>
+      <w:tr>
+        <w:tc>
+          <w:tcPr>
+            <w:tcW w:w="8640" w:type="dxa"/>
+          </w:tcPr>
+          <w:p>
+            <w:pPr>
+              <w:spacing w:before="0" w:after="120"/>
+            </w:pPr>
+            <w:r>
+              <w:t>This pre-week page should render before Week 1 instead of being forced into a weekly module.</w:t>
+            </w:r>
+          </w:p>
+          <w:p>
+            <w:pPr>
+              <w:spacing w:before="160" w:after="40"/>
+            </w:pPr>
+            <w:r>
+              <w:rPr>
+                <w:b/>
+              </w:rPr>
+              <w:t>Milestones:</w:t>
+            </w:r>
+          </w:p>
+          <w:p>
+            <w:pPr>
+              <w:pStyle w:val="ListBullet"/>
+              <w:spacing w:before="0" w:after="40"/>
+            </w:pPr>
+            <w:r>
+              <w:t>Review the course overview.</w:t>
+            </w:r>
+          </w:p>
+          <w:p>
+            <w:pPr>
+              <w:pStyle w:val="ListBullet"/>
+              <w:spacing w:before="0" w:after="40"/>
+            </w:pPr>
+            <w:r>
+              <w:t>Confirm the activity joins.</w:t>
+            </w:r>
+          </w:p>
+          <w:p>
+            <w:pPr>
+              <w:pStyle w:val="ListBullet"/>
+              <w:spacing w:before="0" w:after="40"/>
+            </w:pPr>
+            <w:r>
+              <w:t>Flag missing fields for human review.</w:t>
+            </w:r>
+          </w:p>
+          <w:p>
+            <w:pPr>
+              <w:spacing w:before="160" w:after="40"/>
+            </w:pPr>
+            <w:r>
+              <w:rPr>
+                <w:b/>
+              </w:rPr>
+              <w:t>Tooling Notes:</w:t>
+            </w:r>
+          </w:p>
+          <w:p>
+            <w:pPr>
+              <w:spacing w:before="0" w:after="120"/>
+            </w:pPr>
+            <w:r>
+              <w:t>The bundle also emits inventory, manifest probe, course structure, activity workbook, QA, JSON, Markdown, and DOCX outputs.</w:t>
+            </w:r>
+          </w:p>
+        </w:tc>
+      </w:tr>
+    </w:tbl>
+    <w:p/>
     <w:p>
       <w:r>
         <w:rPr>
@@ -307,7 +603,140 @@
               <w:spacing w:before="0" w:after="120"/>
             </w:pPr>
             <w:r>
-              <w:t>This week introduces the purpose and structure of the course.</w:t>
+              <w:t>This week introduces source tracing and module placement.</w:t>
+            </w:r>
+          </w:p>
+          <w:p>
+            <w:pPr>
+              <w:spacing w:before="160" w:after="40"/>
+            </w:pPr>
+            <w:r>
+              <w:rPr>
+                <w:b/>
+              </w:rPr>
+              <w:t>Required Resources:</w:t>
+            </w:r>
+          </w:p>
+          <w:p>
+            <w:pPr>
+              <w:spacing w:before="0" w:after="120"/>
+            </w:pPr>
+            <w:r>
+              <w:t>This resource-like heading intentionally remains in Overview because Week 1 also has a separate Learning Materials page.</w:t>
+            </w:r>
+          </w:p>
+          <w:p>
+            <w:pPr>
+              <w:spacing w:before="120" w:after="80"/>
+              <w:shd w:val="clear" w:color="auto" w:fill="F7F9FB"/>
+            </w:pPr>
+            <w:r>
+              <w:rPr>
+                <w:b/>
+                <w:color w:val="4D4D4D"/>
+                <w:sz w:val="18"/>
+              </w:rPr>
+              <w:t xml:space="preserve">Visual cue: </w:t>
+            </w:r>
+            <w:r>
+              <w:t>Callout</w:t>
+            </w:r>
+          </w:p>
+          <w:p>
+            <w:pPr>
+              <w:spacing w:before="0" w:after="120"/>
+            </w:pPr>
+            <w:r>
+              <w:t>Visual callout cue: reviewers should see this as a callout marker, not exact Brightspace styling.</w:t>
+            </w:r>
+          </w:p>
+          <w:p>
+            <w:pPr>
+              <w:spacing w:before="120" w:after="80"/>
+              <w:shd w:val="clear" w:color="auto" w:fill="F7F9FB"/>
+            </w:pPr>
+            <w:r>
+              <w:rPr>
+                <w:b/>
+                <w:color w:val="4D4D4D"/>
+                <w:sz w:val="18"/>
+              </w:rPr>
+              <w:t xml:space="preserve">Dropdown / expandable section: </w:t>
+            </w:r>
+            <w:r>
+              <w:t>Expandable instructor note</w:t>
+            </w:r>
+          </w:p>
+          <w:p>
+            <w:pPr>
+              <w:spacing w:before="0" w:after="120"/>
+            </w:pPr>
+            <w:r>
+              <w:t>Dropdown content is preserved as a review cue.</w:t>
+            </w:r>
+          </w:p>
+          <w:p>
+            <w:pPr>
+              <w:spacing w:before="120" w:after="80"/>
+              <w:shd w:val="clear" w:color="auto" w:fill="F7F9FB"/>
+            </w:pPr>
+            <w:r>
+              <w:rPr>
+                <w:b/>
+                <w:color w:val="4D4D4D"/>
+                <w:sz w:val="18"/>
+              </w:rPr>
+              <w:t xml:space="preserve">Embedded image: </w:t>
+            </w:r>
+            <w:r>
+              <w:t>Planning cycle diagram</w:t>
+            </w:r>
+            <w:r>
+              <w:rPr>
+                <w:color w:val="808080"/>
+                <w:sz w:val="16"/>
+              </w:rPr>
+              <w:t xml:space="preserve"> (../assets/planning-cycle.png)</w:t>
+            </w:r>
+          </w:p>
+          <w:p>
+            <w:pPr>
+              <w:spacing w:before="120" w:after="80"/>
+              <w:shd w:val="clear" w:color="auto" w:fill="F7F9FB"/>
+            </w:pPr>
+            <w:r>
+              <w:rPr>
+                <w:b/>
+                <w:color w:val="4D4D4D"/>
+                <w:sz w:val="18"/>
+              </w:rPr>
+              <w:t xml:space="preserve">Embedded image: </w:t>
+            </w:r>
+            <w:r>
+              <w:t>No alt text</w:t>
+            </w:r>
+            <w:r>
+              <w:rPr>
+                <w:color w:val="808080"/>
+                <w:sz w:val="16"/>
+              </w:rPr>
+              <w:t xml:space="preserve"> (../assets/equation-screenshot.png)</w:t>
+            </w:r>
+          </w:p>
+          <w:p>
+            <w:pPr>
+              <w:spacing w:before="120" w:after="120"/>
+              <w:pBdr>
+                <w:bottom w:val="single" w:sz="6" w:space="1" w:color="D9D9D9"/>
+              </w:pBdr>
+            </w:pPr>
+          </w:p>
+          <w:p>
+            <w:pPr>
+              <w:spacing w:before="0" w:after="120"/>
+            </w:pPr>
+            <w:r>
+              <w:t>After the divider, the page continues with authored prose.</w:t>
             </w:r>
           </w:p>
         </w:tc>
@@ -351,10 +780,20 @@
           </w:tcPr>
           <w:p>
             <w:pPr>
-              <w:spacing w:before="0" w:after="120"/>
+              <w:pStyle w:val="ListBullet"/>
+              <w:spacing w:before="0" w:after="40"/>
             </w:pPr>
             <w:r>
-              <w:t>Students will be able to explain the core planning vocabulary.</w:t>
+              <w:t>Explain how manifest items become weekly blueprint rows.</w:t>
+            </w:r>
+          </w:p>
+          <w:p>
+            <w:pPr>
+              <w:pStyle w:val="ListBullet"/>
+              <w:spacing w:before="0" w:after="40"/>
+            </w:pPr>
+            <w:r>
+              <w:t>Recognize hidden and unplaced D2L objects in diagnostics.</w:t>
             </w:r>
           </w:p>
         </w:tc>
@@ -392,7 +831,7 @@
               <w:rPr>
                 <w:b/>
               </w:rPr>
-              <w:t>Week 1 Readings and Media:</w:t>
+              <w:t>Week 1 Learning Materials and Resources:</w:t>
             </w:r>
           </w:p>
           <w:p>
@@ -400,8 +839,77 @@
               <w:spacing w:before="0" w:after="120"/>
             </w:pPr>
             <w:r>
-              <w:t>Read Chapter 1 and watch the orientation video.</w:t>
+              <w:t>This intro belongs with resources because the whole page is a materials page.</w:t>
             </w:r>
+          </w:p>
+          <w:p>
+            <w:pPr>
+              <w:spacing w:before="160" w:after="40"/>
+            </w:pPr>
+            <w:r>
+              <w:rPr>
+                <w:b/>
+              </w:rPr>
+              <w:t>Required Readings:</w:t>
+            </w:r>
+          </w:p>
+          <w:p>
+            <w:pPr>
+              <w:pStyle w:val="ListBullet"/>
+              <w:spacing w:before="0" w:after="40"/>
+            </w:pPr>
+            <w:hyperlink r:id="rId9">
+              <w:r>
+                <w:rPr>
+                  <w:color w:val="0563C1"/>
+                  <w:u w:val="single"/>
+                </w:rPr>
+                <w:t xml:space="preserve">Export anatomy overview</w:t>
+              </w:r>
+            </w:hyperlink>
+          </w:p>
+          <w:p>
+            <w:pPr>
+              <w:pStyle w:val="ListBullet"/>
+              <w:spacing w:before="0" w:after="40"/>
+            </w:pPr>
+            <w:r>
+              <w:t>Read the case packet attached in the module.</w:t>
+            </w:r>
+          </w:p>
+          <w:p>
+            <w:pPr>
+              <w:spacing w:before="160" w:after="40"/>
+            </w:pPr>
+            <w:r>
+              <w:rPr>
+                <w:b/>
+              </w:rPr>
+              <w:t>Multimedia:</w:t>
+            </w:r>
+          </w:p>
+          <w:p>
+            <w:pPr>
+              <w:spacing w:before="120" w:after="80"/>
+              <w:shd w:val="clear" w:color="auto" w:fill="F7F9FB"/>
+            </w:pPr>
+            <w:r>
+              <w:rPr>
+                <w:b/>
+                <w:color w:val="4D4D4D"/>
+                <w:sz w:val="18"/>
+              </w:rPr>
+              <w:t xml:space="preserve">Video embed: </w:t>
+            </w:r>
+            <w:hyperlink r:id="rId10">
+              <w:r>
+                <w:rPr>
+                  <w:color w:val="0563C1"/>
+                  <w:u w:val="single"/>
+                </w:rPr>
+                <w:t xml:space="preserve">Orientation video</w:t>
+              </w:r>
+            </w:hyperlink>
           </w:p>
         </w:tc>
       </w:tr>
@@ -454,10 +962,231 @@
           </w:p>
           <w:p>
             <w:pPr>
+              <w:spacing w:before="40" w:after="40"/>
+            </w:pPr>
+            <w:r>
+              <w:rPr>
+                <w:b/>
+              </w:rPr>
+              <w:t>Rubric: RUB-1: Planning Memo Rubric</w:t>
+            </w:r>
+          </w:p>
+          <w:p>
+            <w:pPr>
               <w:spacing w:before="0" w:after="120"/>
             </w:pPr>
             <w:r>
-              <w:t>Draft a short planning memo.</w:t>
+              <w:t>Draft a short planning memo that names the evidence files you inspected.</w:t>
+            </w:r>
+          </w:p>
+          <w:p>
+            <w:pPr>
+              <w:pStyle w:val="ListBullet"/>
+              <w:spacing w:before="0" w:after="40"/>
+            </w:pPr>
+            <w:r>
+              <w:t>Use one paragraph for the manifest evidence.</w:t>
+            </w:r>
+          </w:p>
+          <w:p>
+            <w:pPr>
+              <w:pStyle w:val="ListBullet"/>
+              <w:spacing w:before="0" w:after="40"/>
+            </w:pPr>
+            <w:r>
+              <w:t>Use one paragraph for the activity join evidence.</w:t>
+            </w:r>
+          </w:p>
+          <w:p>
+            <w:pPr>
+              <w:spacing w:before="120" w:after="120"/>
+              <w:pBdr>
+                <w:bottom w:val="single" w:sz="6" w:space="1" w:color="D9D9D9"/>
+              </w:pBdr>
+            </w:pPr>
+          </w:p>
+          <w:p>
+            <w:pPr>
+              <w:spacing w:before="40" w:after="40"/>
+            </w:pPr>
+            <w:r>
+              <w:rPr>
+                <w:b/>
+              </w:rPr>
+              <w:t>Data Snapshot Worksheet:</w:t>
+            </w:r>
+          </w:p>
+          <w:p>
+            <w:pPr>
+              <w:spacing w:before="40" w:after="40"/>
+            </w:pPr>
+            <w:r>
+              <w:rPr>
+                <w:b/>
+              </w:rPr>
+              <w:t>Points: 10 pts</w:t>
+            </w:r>
+          </w:p>
+          <w:p>
+            <w:pPr>
+              <w:spacing w:before="0" w:after="120"/>
+            </w:pPr>
+            <w:r>
+              <w:t>Complete the worksheet using the course activities workbook generated by the bundle.</w:t>
+            </w:r>
+          </w:p>
+          <w:p>
+            <w:pPr>
+              <w:spacing w:before="120" w:after="120"/>
+              <w:pBdr>
+                <w:bottom w:val="single" w:sz="6" w:space="1" w:color="D9D9D9"/>
+              </w:pBdr>
+            </w:pPr>
+          </w:p>
+          <w:p>
+            <w:pPr>
+              <w:spacing w:before="40" w:after="40"/>
+            </w:pPr>
+            <w:r>
+              <w:rPr>
+                <w:b/>
+              </w:rPr>
+              <w:t>Quiz: Readiness Quiz:</w:t>
+            </w:r>
+          </w:p>
+          <w:p>
+            <w:pPr>
+              <w:spacing w:before="40" w:after="40"/>
+            </w:pPr>
+            <w:r>
+              <w:rPr>
+                <w:b/>
+              </w:rPr>
+              <w:t>Points: 3 pts</w:t>
+            </w:r>
+          </w:p>
+          <w:p>
+            <w:pPr>
+              <w:spacing w:before="40" w:after="40"/>
+            </w:pPr>
+            <w:r>
+              <w:rPr>
+                <w:b/>
+              </w:rPr>
+              <w:t>Gradebook item: Readiness Quiz</w:t>
+            </w:r>
+          </w:p>
+          <w:p>
+            <w:pPr>
+              <w:spacing w:before="40" w:after="40"/>
+            </w:pPr>
+            <w:r>
+              <w:rPr>
+                <w:b/>
+              </w:rPr>
+              <w:t>Attempts allowed: 1</w:t>
+            </w:r>
+          </w:p>
+          <w:p>
+            <w:pPr>
+              <w:spacing w:before="40" w:after="40"/>
+            </w:pPr>
+            <w:r>
+              <w:rPr>
+                <w:b/>
+              </w:rPr>
+              <w:t>Time limit: 20 minutes</w:t>
+            </w:r>
+          </w:p>
+          <w:p>
+            <w:pPr>
+              <w:spacing w:before="40" w:after="40"/>
+            </w:pPr>
+            <w:r>
+              <w:rPr>
+                <w:b/>
+              </w:rPr>
+              <w:t>Time limit enforced: yes</w:t>
+            </w:r>
+          </w:p>
+          <w:p>
+            <w:pPr>
+              <w:spacing w:before="40" w:after="40"/>
+            </w:pPr>
+            <w:r>
+              <w:rPr>
+                <w:b/>
+              </w:rPr>
+              <w:t>Sections: 1</w:t>
+            </w:r>
+          </w:p>
+          <w:p>
+            <w:pPr>
+              <w:spacing w:before="0" w:after="120"/>
+            </w:pPr>
+            <w:r>
+              <w:t>Complete this short readiness check after reviewing the Week 1 materials.</w:t>
+            </w:r>
+          </w:p>
+          <w:p>
+            <w:pPr>
+              <w:pStyle w:val="ListBullet"/>
+              <w:spacing w:before="0" w:after="40"/>
+            </w:pPr>
+            <w:r>
+              <w:t>One attempt is allowed.</w:t>
+            </w:r>
+          </w:p>
+          <w:p>
+            <w:pPr>
+              <w:pStyle w:val="ListBullet"/>
+              <w:spacing w:before="0" w:after="40"/>
+            </w:pPr>
+            <w:r>
+              <w:t>Questions are drawn from a small pool.</w:t>
+            </w:r>
+          </w:p>
+          <w:p>
+            <w:pPr>
+              <w:spacing w:before="120" w:after="120"/>
+              <w:pBdr>
+                <w:bottom w:val="single" w:sz="6" w:space="1" w:color="D9D9D9"/>
+              </w:pBdr>
+            </w:pPr>
+          </w:p>
+          <w:p>
+            <w:pPr>
+              <w:spacing w:before="40" w:after="40"/>
+            </w:pPr>
+            <w:r>
+              <w:rPr>
+                <w:b/>
+              </w:rPr>
+              <w:t>Quiz: Draft Quiz - Hidden:</w:t>
+            </w:r>
+          </w:p>
+          <w:p>
+            <w:pPr>
+              <w:spacing w:before="120" w:after="80"/>
+              <w:shd w:val="clear" w:color="auto" w:fill="F7F9FB"/>
+            </w:pPr>
+            <w:r>
+              <w:rPr>
+                <w:b/>
+                <w:color w:val="4D4D4D"/>
+                <w:sz w:val="18"/>
+              </w:rPr>
+              <w:t xml:space="preserve">Hidden manifest item: </w:t>
+            </w:r>
+            <w:r>
+              <w:t>Object: Draft Quiz - Hidden; type: quiz link; hidden in the Brightspace manifest, so details were not extracted</w:t>
+            </w:r>
+            <w:r>
+              <w:rPr>
+                <w:color w:val="808080"/>
+                <w:sz w:val="16"/>
+              </w:rPr>
+              <w:t xml:space="preserve"> (/d2l/common/dialogs/quickLink/quickLink.d2l?type=quiz&amp;rCode=CODE-QH)</w:t>
             </w:r>
           </w:p>
         </w:tc>
@@ -500,10 +1229,146 @@
           </w:p>
           <w:p>
             <w:pPr>
+              <w:spacing w:before="40" w:after="40"/>
+            </w:pPr>
+            <w:r>
+              <w:rPr>
+                <w:b/>
+              </w:rPr>
+              <w:t>Points: 5 pts</w:t>
+            </w:r>
+          </w:p>
+          <w:p>
+            <w:pPr>
               <w:spacing w:before="0" w:after="120"/>
             </w:pPr>
             <w:r>
-              <w:t>Post one assumption you bring into the course.</w:t>
+              <w:t>Post one assumption you bring into source-traceable course review.</w:t>
+            </w:r>
+          </w:p>
+          <w:p>
+            <w:pPr>
+              <w:spacing w:before="120" w:after="120"/>
+              <w:pBdr>
+                <w:bottom w:val="single" w:sz="6" w:space="1" w:color="D9D9D9"/>
+              </w:pBdr>
+            </w:pPr>
+          </w:p>
+          <w:p>
+            <w:pPr>
+              <w:spacing w:before="40" w:after="40"/>
+            </w:pPr>
+            <w:r>
+              <w:rPr>
+                <w:b/>
+              </w:rPr>
+              <w:t>Peer Reply:</w:t>
+            </w:r>
+          </w:p>
+          <w:p>
+            <w:pPr>
+              <w:spacing w:before="40" w:after="40"/>
+            </w:pPr>
+            <w:r>
+              <w:rPr>
+                <w:b/>
+              </w:rPr>
+              <w:t>Points: 5 pts</w:t>
+            </w:r>
+          </w:p>
+          <w:p>
+            <w:pPr>
+              <w:spacing w:before="0" w:after="120"/>
+            </w:pPr>
+            <w:r>
+              <w:t>Reply to a peer and identify one item that should remain marked for review.</w:t>
+            </w:r>
+          </w:p>
+        </w:tc>
+      </w:tr>
+      <w:tr>
+        <w:tc>
+          <w:tcPr>
+            <w:tcW w:w="8640" w:type="dxa"/>
+            <w:shd w:val="clear" w:color="auto" w:fill="F2F2F2"/>
+          </w:tcPr>
+          <w:p>
+            <w:pPr>
+              <w:spacing w:before="0" w:after="40"/>
+            </w:pPr>
+            <w:r>
+              <w:rPr>
+                <w:b/>
+                <w:sz w:val="18"/>
+              </w:rPr>
+              <w:t>Checklist (mirrored from the export)</w:t>
+            </w:r>
+          </w:p>
+        </w:tc>
+      </w:tr>
+      <w:tr>
+        <w:tc>
+          <w:tcPr>
+            <w:tcW w:w="8640" w:type="dxa"/>
+          </w:tcPr>
+          <w:p>
+            <w:pPr>
+              <w:spacing w:before="0" w:after="40"/>
+            </w:pPr>
+            <w:r>
+              <w:rPr>
+                <w:b/>
+              </w:rPr>
+              <w:t>Week 1 Checklist:</w:t>
+            </w:r>
+          </w:p>
+          <w:p>
+            <w:pPr>
+              <w:spacing w:before="40" w:after="40"/>
+            </w:pPr>
+            <w:r>
+              <w:rPr>
+                <w:b/>
+              </w:rPr>
+              <w:t>Review outputs:</w:t>
+            </w:r>
+          </w:p>
+          <w:p>
+            <w:pPr>
+              <w:pStyle w:val="ListBullet"/>
+              <w:spacing w:before="0" w:after="40"/>
+            </w:pPr>
+            <w:r>
+              <w:t>Open the Markdown blueprint</w:t>
+            </w:r>
+          </w:p>
+          <w:p>
+            <w:pPr>
+              <w:pStyle w:val="ListBullet"/>
+              <w:spacing w:before="0" w:after="40"/>
+            </w:pPr>
+            <w:r>
+              <w:t>Inspect the DOCX rendering</w:t>
+            </w:r>
+          </w:p>
+          <w:p>
+            <w:pPr>
+              <w:spacing w:before="160" w:after="40"/>
+            </w:pPr>
+            <w:r>
+              <w:rPr>
+                <w:b/>
+              </w:rPr>
+              <w:t>Trace evidence:</w:t>
+            </w:r>
+          </w:p>
+          <w:p>
+            <w:pPr>
+              <w:pStyle w:val="ListBullet"/>
+              <w:spacing w:before="0" w:after="40"/>
+            </w:pPr>
+            <w:r>
+              <w:t>Compare the manifest probe with the weekly rows</w:t>
             </w:r>
           </w:p>
         </w:tc>
@@ -541,7 +1406,95 @@
               <w:rPr>
                 <w:b/>
               </w:rPr>
-              <w:t>Lecture: Framing the Field:</w:t>
+              <w:t>Creator+ Practice:</w:t>
+            </w:r>
+          </w:p>
+          <w:p>
+            <w:pPr>
+              <w:spacing w:before="40" w:after="40"/>
+            </w:pPr>
+            <w:r>
+              <w:rPr>
+                <w:b/>
+              </w:rPr>
+              <w:t>Creator+ practice: Sort Course Evidence</w:t>
+            </w:r>
+          </w:p>
+          <w:p>
+            <w:pPr>
+              <w:spacing w:before="40" w:after="40"/>
+            </w:pPr>
+            <w:r>
+              <w:rPr>
+                <w:b/>
+              </w:rPr>
+              <w:t>Practice type: Sorting</w:t>
+            </w:r>
+          </w:p>
+          <w:p>
+            <w:pPr>
+              <w:spacing w:before="40" w:after="40"/>
+            </w:pPr>
+            <w:r>
+              <w:rPr>
+                <w:b/>
+              </w:rPr>
+              <w:t>Source file: practice/week1-sort.practice.json</w:t>
+            </w:r>
+          </w:p>
+          <w:p>
+            <w:pPr>
+              <w:spacing w:before="40" w:after="40"/>
+            </w:pPr>
+            <w:r>
+              <w:rPr>
+                <w:b/>
+              </w:rPr>
+              <w:t>Practice id: sample-sort-1</w:t>
+            </w:r>
+          </w:p>
+          <w:p>
+            <w:pPr>
+              <w:spacing w:before="40" w:after="40"/>
+            </w:pPr>
+            <w:r>
+              <w:rPr>
+                <w:b/>
+              </w:rPr>
+              <w:t>Items: 3</w:t>
+            </w:r>
+          </w:p>
+          <w:p>
+            <w:pPr>
+              <w:spacing w:before="40" w:after="40"/>
+            </w:pPr>
+            <w:r>
+              <w:rPr>
+                <w:b/>
+              </w:rPr>
+              <w:t>Categories/slots: 3</w:t>
+            </w:r>
+          </w:p>
+          <w:p>
+            <w:pPr>
+              <w:spacing w:before="40" w:after="40"/>
+            </w:pPr>
+            <w:r>
+              <w:rPr>
+                <w:b/>
+              </w:rPr>
+              <w:t>Scoring: 3 pts</w:t>
+            </w:r>
+          </w:p>
+          <w:p>
+            <w:pPr>
+              <w:spacing w:before="40" w:after="40"/>
+            </w:pPr>
+            <w:r>
+              <w:rPr>
+                <w:b/>
+              </w:rPr>
+              <w:t>Description</w:t>
             </w:r>
           </w:p>
           <w:p>
@@ -549,7 +1502,185 @@
               <w:spacing w:before="0" w:after="120"/>
             </w:pPr>
             <w:r>
-              <w:t>Lecture notes on the field.</w:t>
+              <w:t>Sort each artifact into the evidence layer it comes from.</w:t>
+            </w:r>
+          </w:p>
+          <w:p>
+            <w:pPr>
+              <w:spacing w:before="160" w:after="40"/>
+            </w:pPr>
+            <w:r>
+              <w:rPr>
+                <w:b/>
+              </w:rPr>
+              <w:t>Instructions</w:t>
+            </w:r>
+          </w:p>
+          <w:p>
+            <w:pPr>
+              <w:spacing w:before="0" w:after="120"/>
+            </w:pPr>
+            <w:r>
+              <w:t>Drag each item into manifest, page, or activity evidence.</w:t>
+            </w:r>
+          </w:p>
+          <w:p>
+            <w:pPr>
+              <w:spacing w:before="120" w:after="120"/>
+              <w:pBdr>
+                <w:bottom w:val="single" w:sz="6" w:space="1" w:color="D9D9D9"/>
+              </w:pBdr>
+            </w:pPr>
+          </w:p>
+          <w:p>
+            <w:pPr>
+              <w:spacing w:before="40" w:after="40"/>
+            </w:pPr>
+            <w:r>
+              <w:rPr>
+                <w:b/>
+              </w:rPr>
+              <w:t>Case Packet PDF:</w:t>
+            </w:r>
+          </w:p>
+          <w:p>
+            <w:pPr>
+              <w:spacing w:before="120" w:after="80"/>
+              <w:shd w:val="clear" w:color="auto" w:fill="F7F9FB"/>
+            </w:pPr>
+            <w:r>
+              <w:rPr>
+                <w:b/>
+                <w:color w:val="4D4D4D"/>
+                <w:sz w:val="18"/>
+              </w:rPr>
+              <w:t xml:space="preserve">Attached course file: </w:t>
+            </w:r>
+            <w:r>
+              <w:t>week1-case-packet.pdf</w:t>
+            </w:r>
+            <w:r>
+              <w:rPr>
+                <w:color w:val="808080"/>
+                <w:sz w:val="16"/>
+              </w:rPr>
+              <w:t xml:space="preserve"> (files/week1-case-packet.pdf)</w:t>
+            </w:r>
+          </w:p>
+          <w:p>
+            <w:pPr>
+              <w:spacing w:before="120" w:after="120"/>
+              <w:pBdr>
+                <w:bottom w:val="single" w:sz="6" w:space="1" w:color="D9D9D9"/>
+              </w:pBdr>
+            </w:pPr>
+          </w:p>
+          <w:p>
+            <w:pPr>
+              <w:spacing w:before="40" w:after="40"/>
+            </w:pPr>
+            <w:r>
+              <w:rPr>
+                <w:b/>
+              </w:rPr>
+              <w:t>Scenario Lab:</w:t>
+            </w:r>
+          </w:p>
+          <w:p>
+            <w:pPr>
+              <w:spacing w:before="120" w:after="80"/>
+              <w:shd w:val="clear" w:color="auto" w:fill="F7F9FB"/>
+            </w:pPr>
+            <w:r>
+              <w:rPr>
+                <w:b/>
+                <w:color w:val="4D4D4D"/>
+                <w:sz w:val="18"/>
+              </w:rPr>
+              <w:t xml:space="preserve">Visual cue: </w:t>
+            </w:r>
+            <w:r>
+              <w:t>Case card</w:t>
+            </w:r>
+          </w:p>
+          <w:p>
+            <w:pPr>
+              <w:spacing w:before="0" w:after="120"/>
+            </w:pPr>
+            <w:r>
+              <w:t>A sample stakeholder asks whether a course export preserves its weekly organization.</w:t>
+            </w:r>
+          </w:p>
+          <w:p>
+            <w:pPr>
+              <w:spacing w:before="160" w:after="40"/>
+            </w:pPr>
+            <w:r>
+              <w:rPr>
+                <w:b/>
+              </w:rPr>
+              <w:t>Scenario Lab › Debrief Questions:</w:t>
+            </w:r>
+          </w:p>
+          <w:p>
+            <w:pPr>
+              <w:pStyle w:val="ListBullet"/>
+              <w:spacing w:before="0" w:after="40"/>
+            </w:pPr>
+            <w:r>
+              <w:t>Which evidence file answers the placement question?</w:t>
+            </w:r>
+          </w:p>
+          <w:p>
+            <w:pPr>
+              <w:pStyle w:val="ListBullet"/>
+              <w:spacing w:before="0" w:after="40"/>
+            </w:pPr>
+            <w:r>
+              <w:t>Which fields should remain marked Needs review?</w:t>
+            </w:r>
+          </w:p>
+          <w:p>
+            <w:pPr>
+              <w:spacing w:before="120" w:after="120"/>
+              <w:pBdr>
+                <w:bottom w:val="single" w:sz="6" w:space="1" w:color="D9D9D9"/>
+              </w:pBdr>
+            </w:pPr>
+          </w:p>
+          <w:p>
+            <w:pPr>
+              <w:spacing w:before="40" w:after="40"/>
+            </w:pPr>
+            <w:r>
+              <w:rPr>
+                <w:b/>
+              </w:rPr>
+              <w:t>Instructor Notes Draft:</w:t>
+            </w:r>
+          </w:p>
+          <w:p>
+            <w:pPr>
+              <w:spacing w:before="120" w:after="80"/>
+              <w:shd w:val="clear" w:color="auto" w:fill="F7F9FB"/>
+            </w:pPr>
+            <w:r>
+              <w:rPr>
+                <w:b/>
+                <w:color w:val="4D4D4D"/>
+                <w:sz w:val="18"/>
+              </w:rPr>
+              <w:t xml:space="preserve">Hidden manifest item: </w:t>
+            </w:r>
+            <w:r>
+              <w:t>Object: Instructor Notes Draft; type: DOCX course file; hidden in the Brightspace manifest, so body extraction was skipped</w:t>
+            </w:r>
+            <w:r>
+              <w:rPr>
+                <w:color w:val="808080"/>
+                <w:sz w:val="16"/>
+              </w:rPr>
+              <w:t xml:space="preserve"> (files/hidden-instructor-notes.docx)</w:t>
             </w:r>
           </w:p>
         </w:tc>
@@ -629,7 +1760,7 @@
               <w:spacing w:before="0" w:after="120"/>
             </w:pPr>
             <w:r>
-              <w:t>Week 2 builds on planning vocabulary.</w:t>
+              <w:t>This combined page demonstrates overview and materials splitting within one page.</w:t>
             </w:r>
           </w:p>
         </w:tc>
@@ -708,12 +1839,22 @@
             <w:tcW w:w="8640" w:type="dxa"/>
           </w:tcPr>
           <w:p>
+            <w:pPr>
+              <w:spacing w:before="0" w:after="40"/>
+            </w:pPr>
             <w:r>
               <w:rPr>
-                <w:i/>
-                <w:color w:val="808080"/>
+                <w:b/>
               </w:rPr>
-              <w:t>None found in export extraction.</w:t>
+              <w:t>Required Resources:</w:t>
+            </w:r>
+          </w:p>
+          <w:p>
+            <w:pPr>
+              <w:spacing w:before="0" w:after="120"/>
+            </w:pPr>
+            <w:r>
+              <w:t>Because there is no separate Week 2 materials page, this heading moves to Assigned Reading and Multimedia.</w:t>
             </w:r>
           </w:p>
         </w:tc>
@@ -744,12 +1885,33 @@
             <w:tcW w:w="8640" w:type="dxa"/>
           </w:tcPr>
           <w:p>
+            <w:pPr>
+              <w:spacing w:before="0" w:after="40"/>
+            </w:pPr>
             <w:r>
               <w:rPr>
-                <w:i/>
-                <w:color w:val="808080"/>
+                <w:b/>
               </w:rPr>
-              <w:t>None found in export extraction.</w:t>
+              <w:t>Reflection Journal:</w:t>
+            </w:r>
+          </w:p>
+          <w:p>
+            <w:pPr>
+              <w:spacing w:before="40" w:after="40"/>
+            </w:pPr>
+            <w:r>
+              <w:rPr>
+                <w:b/>
+              </w:rPr>
+              <w:t>Points: 5 pts</w:t>
+            </w:r>
+          </w:p>
+          <w:p>
+            <w:pPr>
+              <w:spacing w:before="0" w:after="120"/>
+            </w:pPr>
+            <w:r>
+              <w:t>Write a short reflection after reviewing Week 2 materials.</w:t>
             </w:r>
           </w:p>
         </w:tc>
@@ -790,8 +1952,250 @@
           </w:p>
         </w:tc>
       </w:tr>
+      <w:tr>
+        <w:tc>
+          <w:tcPr>
+            <w:tcW w:w="8640" w:type="dxa"/>
+            <w:shd w:val="clear" w:color="auto" w:fill="F2F2F2"/>
+          </w:tcPr>
+          <w:p>
+            <w:pPr>
+              <w:spacing w:before="0" w:after="40"/>
+            </w:pPr>
+            <w:r>
+              <w:rPr>
+                <w:b/>
+                <w:sz w:val="18"/>
+              </w:rPr>
+              <w:t>Checklist (mirrored from the export)</w:t>
+            </w:r>
+          </w:p>
+        </w:tc>
+      </w:tr>
+      <w:tr>
+        <w:tc>
+          <w:tcPr>
+            <w:tcW w:w="8640" w:type="dxa"/>
+          </w:tcPr>
+          <w:p>
+            <w:pPr>
+              <w:spacing w:before="0" w:after="40"/>
+            </w:pPr>
+            <w:r>
+              <w:rPr>
+                <w:b/>
+              </w:rPr>
+              <w:t>Checklist:</w:t>
+            </w:r>
+          </w:p>
+          <w:p>
+            <w:pPr>
+              <w:pStyle w:val="ListBullet"/>
+              <w:spacing w:before="0" w:after="40"/>
+            </w:pPr>
+            <w:r>
+              <w:t>Confirm the sample output still validates.</w:t>
+            </w:r>
+          </w:p>
+          <w:p>
+            <w:pPr>
+              <w:pStyle w:val="ListBullet"/>
+              <w:spacing w:before="0" w:after="40"/>
+            </w:pPr>
+            <w:r>
+              <w:t>Review the extraction notes at the bottom.</w:t>
+            </w:r>
+          </w:p>
+        </w:tc>
+      </w:tr>
+      <w:tr>
+        <w:tc>
+          <w:tcPr>
+            <w:tcW w:w="8640" w:type="dxa"/>
+            <w:shd w:val="clear" w:color="auto" w:fill="F2F2F2"/>
+          </w:tcPr>
+          <w:p>
+            <w:pPr>
+              <w:spacing w:before="0" w:after="40"/>
+            </w:pPr>
+            <w:r>
+              <w:rPr>
+                <w:b/>
+                <w:sz w:val="18"/>
+              </w:rPr>
+              <w:t>Other course sections (mirrored from the export)</w:t>
+            </w:r>
+          </w:p>
+        </w:tc>
+      </w:tr>
+      <w:tr>
+        <w:tc>
+          <w:tcPr>
+            <w:tcW w:w="8640" w:type="dxa"/>
+          </w:tcPr>
+          <w:p>
+            <w:pPr>
+              <w:spacing w:before="0" w:after="40"/>
+            </w:pPr>
+            <w:r>
+              <w:rPr>
+                <w:b/>
+              </w:rPr>
+              <w:t>Practice Activity:</w:t>
+            </w:r>
+          </w:p>
+          <w:p>
+            <w:pPr>
+              <w:spacing w:before="0" w:after="120"/>
+            </w:pPr>
+            <w:r>
+              <w:t>This page demonstrates an Other course section with authored practice instructions.</w:t>
+            </w:r>
+          </w:p>
+          <w:p>
+            <w:pPr>
+              <w:spacing w:before="160" w:after="40"/>
+            </w:pPr>
+            <w:r>
+              <w:rPr>
+                <w:b/>
+              </w:rPr>
+              <w:t>Reflection Prompt:</w:t>
+            </w:r>
+          </w:p>
+          <w:p>
+            <w:pPr>
+              <w:spacing w:before="0" w:after="120"/>
+            </w:pPr>
+            <w:r>
+              <w:t>Write one sentence about where the source evidence appears in the output.</w:t>
+            </w:r>
+          </w:p>
+          <w:p>
+            <w:pPr>
+              <w:spacing w:before="120" w:after="120"/>
+              <w:pBdr>
+                <w:bottom w:val="single" w:sz="6" w:space="1" w:color="D9D9D9"/>
+              </w:pBdr>
+            </w:pPr>
+          </w:p>
+          <w:p>
+            <w:pPr>
+              <w:spacing w:before="40" w:after="40"/>
+            </w:pPr>
+            <w:r>
+              <w:rPr>
+                <w:b/>
+              </w:rPr>
+              <w:t>Hidden Faculty Setup Page:</w:t>
+            </w:r>
+          </w:p>
+          <w:p>
+            <w:pPr>
+              <w:spacing w:before="120" w:after="80"/>
+              <w:shd w:val="clear" w:color="auto" w:fill="F7F9FB"/>
+            </w:pPr>
+            <w:r>
+              <w:rPr>
+                <w:b/>
+                <w:color w:val="4D4D4D"/>
+                <w:sz w:val="18"/>
+              </w:rPr>
+              <w:t xml:space="preserve">Hidden manifest item: </w:t>
+            </w:r>
+            <w:r>
+              <w:t>Object: Hidden Faculty Setup Page; type: HTML content page; hidden in the Brightspace manifest, so body extraction was skipped</w:t>
+            </w:r>
+            <w:r>
+              <w:rPr>
+                <w:color w:val="808080"/>
+                <w:sz w:val="16"/>
+              </w:rPr>
+              <w:t xml:space="preserve"> (pages/hidden-faculty-setup.html)</w:t>
+            </w:r>
+          </w:p>
+        </w:tc>
+      </w:tr>
     </w:tbl>
     <w:p/>
+    <w:p>
+      <w:pPr>
+        <w:pStyle w:val="Heading2"/>
+      </w:pPr>
+      <w:r>
+        <w:t>Unplaced Activities</w:t>
+      </w:r>
+    </w:p>
+    <w:p>
+      <w:r>
+        <w:t>These activities were extracted from D2L object XML but were not connected to a module quicklink by resource code.</w:t>
+      </w:r>
+    </w:p>
+    <w:p>
+      <w:pPr>
+        <w:pStyle w:val="Heading4"/>
+      </w:pPr>
+      <w:r>
+        <w:t>Assignments</w:t>
+      </w:r>
+    </w:p>
+    <w:p>
+      <w:pPr>
+        <w:spacing w:before="0" w:after="40"/>
+      </w:pPr>
+      <w:r>
+        <w:rPr>
+          <w:b/>
+        </w:rPr>
+        <w:t>Unplaced Capstone Draft:</w:t>
+      </w:r>
+    </w:p>
+    <w:p>
+      <w:pPr>
+        <w:spacing w:before="40" w:after="40"/>
+      </w:pPr>
+      <w:r>
+        <w:rPr>
+          <w:b/>
+        </w:rPr>
+        <w:t>Points: 15 pts</w:t>
+      </w:r>
+    </w:p>
+    <w:p>
+      <w:pPr>
+        <w:spacing w:before="0" w:after="120"/>
+      </w:pPr>
+      <w:r>
+        <w:t>This assignment is not linked in the manifest and should appear as unplaced.</w:t>
+      </w:r>
+    </w:p>
+    <w:p>
+      <w:pPr>
+        <w:pStyle w:val="Heading4"/>
+      </w:pPr>
+      <w:r>
+        <w:t>Discussions</w:t>
+      </w:r>
+    </w:p>
+    <w:p>
+      <w:pPr>
+        <w:spacing w:before="0" w:after="40"/>
+      </w:pPr>
+      <w:r>
+        <w:rPr>
+          <w:b/>
+        </w:rPr>
+        <w:t>Unplaced Help Forum:</w:t>
+      </w:r>
+    </w:p>
+    <w:p>
+      <w:pPr>
+        <w:spacing w:before="0" w:after="120"/>
+      </w:pPr>
+      <w:r>
+        <w:t>This discussion topic is not linked in the manifest and should be reported as unplaced.</w:t>
+      </w:r>
+    </w:p>
     <w:p>
       <w:pPr>
         <w:pStyle w:val="Heading2"/>
@@ -806,7 +2210,52 @@
         <w:spacing w:before="0" w:after="40"/>
       </w:pPr>
       <w:r>
-        <w:t>None.</w:t>
+        <w:t>Structure: content file 'Case Packet PDF': body extraction skipped for non-HTML file: files/week1-case-packet.pdf</w:t>
+      </w:r>
+    </w:p>
+    <w:p>
+      <w:pPr>
+        <w:pStyle w:val="ListBullet"/>
+        <w:spacing w:before="0" w:after="40"/>
+      </w:pPr>
+      <w:r>
+        <w:t>Structure: hidden content 'Instructor Notes Draft': body extraction skipped: files/hidden-instructor-notes.docx</w:t>
+      </w:r>
+    </w:p>
+    <w:p>
+      <w:pPr>
+        <w:pStyle w:val="ListBullet"/>
+        <w:spacing w:before="0" w:after="40"/>
+      </w:pPr>
+      <w:r>
+        <w:t>Structure: hidden content 'Hidden Faculty Setup Page': body extraction skipped: pages/hidden-faculty-setup.html</w:t>
+      </w:r>
+    </w:p>
+    <w:p>
+      <w:pPr>
+        <w:pStyle w:val="ListBullet"/>
+        <w:spacing w:before="0" w:after="40"/>
+      </w:pPr>
+      <w:r>
+        <w:t>Structure: Package scope: hidden manifest-linked files skipped from blueprint body extraction: 2 file(s), 178 B total; by type: html: 1 / 140 B, document: 1 / 38 B; largest: pages/hidden-faculty-setup.html (140 B), files/hidden-instructor-notes.docx (38 B)</w:t>
+      </w:r>
+    </w:p>
+    <w:p>
+      <w:pPr>
+        <w:pStyle w:val="ListBullet"/>
+        <w:spacing w:before="0" w:after="40"/>
+      </w:pPr>
+      <w:r>
+        <w:t>Structure: Package scope: files not directly linked from the visible manifest: 8 file(s), 971 B total; by type: frontend_support: 1 / 585 B, xml: 3 / 234 B, image: 3 / 112 B, document: 1 / 40 B; largest: practice/week1-sort.practice.json (585 B), conditionalrelease_d2l.xml (108 B), survey_d2l_1.xml (78 B), links_d2l.xml (48 B), assets/equation-screenshot.png (47 B), files/unlinked-faculty-deck.pptx (40 B), assets/planning-cycle.png (35 B), assets/unused-diagram.png (30 B) (may include support assets referenced inside HTML pages)</w:t>
+      </w:r>
+    </w:p>
+    <w:p>
+      <w:pPr>
+        <w:pStyle w:val="ListBullet"/>
+        <w:spacing w:before="0" w:after="40"/>
+      </w:pPr>
+      <w:r>
+        <w:t>Routing: Week 1: resource-like heading 'Required Resources' from overview page 'Week 1 Overview' kept in Overview because the module also has a separate resources/materials page.</w:t>
       </w:r>
     </w:p>
     <w:sectPr>

</xml_diff>

<commit_message>
docs: regenerate worked example with the current pipeline
The committed sample_course outputs had drifted stale relative to the
scripts. Regenerated end-to-end so the example again shows real current
output - and so the new golden-run test has an honest baseline to lock in.
</commit_message>
<xml_diff>
--- a/examples/sample_course__blueprint_bundle/sample_course__blueprint.docx
+++ b/examples/sample_course__blueprint_bundle/sample_course__blueprint.docx
@@ -628,7 +628,7 @@
           <w:p>
             <w:pPr>
               <w:spacing w:before="120" w:after="80"/>
-              <w:shd w:val="clear" w:color="auto" w:fill="F7F9FB"/>
+              <w:shd w:val="clear" w:color="auto" w:fill="F2F6FA"/>
             </w:pPr>
             <w:r>
               <w:rPr>
@@ -645,6 +645,7 @@
           <w:p>
             <w:pPr>
               <w:spacing w:before="0" w:after="120"/>
+              <w:shd w:val="clear" w:color="auto" w:fill="F2F6FA"/>
             </w:pPr>
             <w:r>
               <w:t>Visual callout cue: reviewers should see this as a callout marker, not exact Brightspace styling.</w:t>
@@ -653,7 +654,7 @@
           <w:p>
             <w:pPr>
               <w:spacing w:before="120" w:after="80"/>
-              <w:shd w:val="clear" w:color="auto" w:fill="F7F9FB"/>
+              <w:shd w:val="clear" w:color="auto" w:fill="F4F2FA"/>
             </w:pPr>
             <w:r>
               <w:rPr>
@@ -1146,49 +1147,6 @@
               <w:t>Questions are drawn from a small pool.</w:t>
             </w:r>
           </w:p>
-          <w:p>
-            <w:pPr>
-              <w:spacing w:before="120" w:after="120"/>
-              <w:pBdr>
-                <w:bottom w:val="single" w:sz="6" w:space="1" w:color="D9D9D9"/>
-              </w:pBdr>
-            </w:pPr>
-          </w:p>
-          <w:p>
-            <w:pPr>
-              <w:spacing w:before="40" w:after="40"/>
-            </w:pPr>
-            <w:r>
-              <w:rPr>
-                <w:b/>
-              </w:rPr>
-              <w:t>Quiz: Draft Quiz - Hidden:</w:t>
-            </w:r>
-          </w:p>
-          <w:p>
-            <w:pPr>
-              <w:spacing w:before="120" w:after="80"/>
-              <w:shd w:val="clear" w:color="auto" w:fill="F7F9FB"/>
-            </w:pPr>
-            <w:r>
-              <w:rPr>
-                <w:b/>
-                <w:color w:val="4D4D4D"/>
-                <w:sz w:val="18"/>
-              </w:rPr>
-              <w:t xml:space="preserve">Hidden manifest item: </w:t>
-            </w:r>
-            <w:r>
-              <w:t>Object: Draft Quiz - Hidden; type: quiz link; hidden in the Brightspace manifest, so details were not extracted</w:t>
-            </w:r>
-            <w:r>
-              <w:rPr>
-                <w:color w:val="808080"/>
-                <w:sz w:val="16"/>
-              </w:rPr>
-              <w:t xml:space="preserve"> (/d2l/common/dialogs/quickLink/quickLink.d2l?type=quiz&amp;rCode=CODE-QH)</w:t>
-            </w:r>
-          </w:p>
         </w:tc>
       </w:tr>
       <w:tr>
@@ -1411,84 +1369,37 @@
           </w:p>
           <w:p>
             <w:pPr>
-              <w:spacing w:before="40" w:after="40"/>
+              <w:spacing w:before="120" w:after="100"/>
+              <w:shd w:val="clear" w:color="auto" w:fill="EEF7F2"/>
             </w:pPr>
             <w:r>
               <w:rPr>
                 <w:b/>
+                <w:sz w:val="18"/>
               </w:rPr>
               <w:t>Creator+ practice: Sort Course Evidence</w:t>
+            </w:r>
+            <w:r>
+              <w:rPr>
+                <w:color w:val="707070"/>
+                <w:sz w:val="16"/>
+              </w:rPr>
+              <w:t xml:space="preserve"> (https://practices.lcs.brightspace.com/player)</w:t>
+            </w:r>
+            <w:r>
+              <w:br/>
+            </w:r>
+            <w:r>
+              <w:rPr>
+                <w:color w:val="4D4D4D"/>
+                <w:sz w:val="16"/>
+              </w:rPr>
+              <w:t>Practice type: Sorting; Source file: practice/week1-sort.practice.json; Practice id: sample-sort-1; Items: 3; Categories/slots: 3; Scoring: 3 pts</w:t>
             </w:r>
           </w:p>
           <w:p>
             <w:pPr>
-              <w:spacing w:before="40" w:after="40"/>
-            </w:pPr>
-            <w:r>
-              <w:rPr>
-                <w:b/>
-              </w:rPr>
-              <w:t>Practice type: Sorting</w:t>
-            </w:r>
-          </w:p>
-          <w:p>
-            <w:pPr>
-              <w:spacing w:before="40" w:after="40"/>
-            </w:pPr>
-            <w:r>
-              <w:rPr>
-                <w:b/>
-              </w:rPr>
-              <w:t>Source file: practice/week1-sort.practice.json</w:t>
-            </w:r>
-          </w:p>
-          <w:p>
-            <w:pPr>
-              <w:spacing w:before="40" w:after="40"/>
-            </w:pPr>
-            <w:r>
-              <w:rPr>
-                <w:b/>
-              </w:rPr>
-              <w:t>Practice id: sample-sort-1</w:t>
-            </w:r>
-          </w:p>
-          <w:p>
-            <w:pPr>
-              <w:spacing w:before="40" w:after="40"/>
-            </w:pPr>
-            <w:r>
-              <w:rPr>
-                <w:b/>
-              </w:rPr>
-              <w:t>Items: 3</w:t>
-            </w:r>
-          </w:p>
-          <w:p>
-            <w:pPr>
-              <w:spacing w:before="40" w:after="40"/>
-            </w:pPr>
-            <w:r>
-              <w:rPr>
-                <w:b/>
-              </w:rPr>
-              <w:t>Categories/slots: 3</w:t>
-            </w:r>
-          </w:p>
-          <w:p>
-            <w:pPr>
-              <w:spacing w:before="40" w:after="40"/>
-            </w:pPr>
-            <w:r>
-              <w:rPr>
-                <w:b/>
-              </w:rPr>
-              <w:t>Scoring: 3 pts</w:t>
-            </w:r>
-          </w:p>
-          <w:p>
-            <w:pPr>
-              <w:spacing w:before="40" w:after="40"/>
+              <w:spacing w:before="160" w:after="40"/>
             </w:pPr>
             <w:r>
               <w:rPr>
@@ -1589,7 +1500,7 @@
           <w:p>
             <w:pPr>
               <w:spacing w:before="120" w:after="80"/>
-              <w:shd w:val="clear" w:color="auto" w:fill="F7F9FB"/>
+              <w:shd w:val="clear" w:color="auto" w:fill="F2F6FA"/>
             </w:pPr>
             <w:r>
               <w:rPr>
@@ -1606,6 +1517,7 @@
           <w:p>
             <w:pPr>
               <w:spacing w:before="0" w:after="120"/>
+              <w:shd w:val="clear" w:color="auto" w:fill="F2F6FA"/>
             </w:pPr>
             <w:r>
               <w:t>A sample stakeholder asks whether a course export preserves its weekly organization.</w:t>
@@ -1656,13 +1568,13 @@
               <w:rPr>
                 <w:b/>
               </w:rPr>
-              <w:t>Instructor Notes Draft:</w:t>
+              <w:t>Draft Quiz - Hidden:</w:t>
             </w:r>
           </w:p>
           <w:p>
             <w:pPr>
               <w:spacing w:before="120" w:after="80"/>
-              <w:shd w:val="clear" w:color="auto" w:fill="F7F9FB"/>
+              <w:shd w:val="clear" w:color="auto" w:fill="FFF4E5"/>
             </w:pPr>
             <w:r>
               <w:rPr>
@@ -1673,7 +1585,50 @@
               <w:t xml:space="preserve">Hidden manifest item: </w:t>
             </w:r>
             <w:r>
-              <w:t>Object: Instructor Notes Draft; type: DOCX course file; hidden in the Brightspace manifest, so body extraction was skipped</w:t>
+              <w:t>Object: Draft Quiz - Hidden; type: quiz link; hidden/faculty-facing in the Brightspace manifest. The manifest link is hidden/faculty-facing; any manifest description is included below.</w:t>
+            </w:r>
+            <w:r>
+              <w:rPr>
+                <w:color w:val="808080"/>
+                <w:sz w:val="16"/>
+              </w:rPr>
+              <w:t xml:space="preserve"> (/d2l/common/dialogs/quickLink/quickLink.d2l?type=quiz&amp;rCode=CODE-QH)</w:t>
+            </w:r>
+          </w:p>
+          <w:p>
+            <w:pPr>
+              <w:spacing w:before="120" w:after="120"/>
+              <w:pBdr>
+                <w:bottom w:val="single" w:sz="6" w:space="1" w:color="D9D9D9"/>
+              </w:pBdr>
+            </w:pPr>
+          </w:p>
+          <w:p>
+            <w:pPr>
+              <w:spacing w:before="40" w:after="40"/>
+            </w:pPr>
+            <w:r>
+              <w:rPr>
+                <w:b/>
+              </w:rPr>
+              <w:t>Instructor Notes Draft:</w:t>
+            </w:r>
+          </w:p>
+          <w:p>
+            <w:pPr>
+              <w:spacing w:before="120" w:after="80"/>
+              <w:shd w:val="clear" w:color="auto" w:fill="FFF4E5"/>
+            </w:pPr>
+            <w:r>
+              <w:rPr>
+                <w:b/>
+                <w:color w:val="4D4D4D"/>
+                <w:sz w:val="18"/>
+              </w:rPr>
+              <w:t xml:space="preserve">Hidden manifest item: </w:t>
+            </w:r>
+            <w:r>
+              <w:t>Object: Instructor Notes Draft; type: DOCX course file; hidden/faculty-facing in the Brightspace manifest. The linked course file is hidden/faculty-facing and was preserved as a file reference.</w:t>
             </w:r>
             <w:r>
               <w:rPr>
@@ -2087,13 +2042,13 @@
               <w:rPr>
                 <w:b/>
               </w:rPr>
-              <w:t>Hidden Faculty Setup Page:</w:t>
+              <w:t>Hidden Faculty Setup Page › Hidden Setup:</w:t>
             </w:r>
           </w:p>
           <w:p>
             <w:pPr>
               <w:spacing w:before="120" w:after="80"/>
-              <w:shd w:val="clear" w:color="auto" w:fill="F7F9FB"/>
+              <w:shd w:val="clear" w:color="auto" w:fill="FFF4E5"/>
             </w:pPr>
             <w:r>
               <w:rPr>
@@ -2104,7 +2059,7 @@
               <w:t xml:space="preserve">Hidden manifest item: </w:t>
             </w:r>
             <w:r>
-              <w:t>Object: Hidden Faculty Setup Page; type: HTML content page; hidden in the Brightspace manifest, so body extraction was skipped</w:t>
+              <w:t>Object: Hidden Faculty Setup Page; type: HTML content page; hidden/faculty-facing in the Brightspace manifest. Body text was extracted below for review; keep in mind this item is hidden/faculty-facing.</w:t>
             </w:r>
             <w:r>
               <w:rPr>
@@ -2112,6 +2067,14 @@
                 <w:sz w:val="16"/>
               </w:rPr>
               <w:t xml:space="preserve"> (pages/hidden-faculty-setup.html)</w:t>
+            </w:r>
+          </w:p>
+          <w:p>
+            <w:pPr>
+              <w:spacing w:before="0" w:after="120"/>
+            </w:pPr>
+            <w:r>
+              <w:t>This body should not be unpacked because the manifest item is hidden.</w:t>
             </w:r>
           </w:p>
         </w:tc>
@@ -2219,7 +2182,7 @@
         <w:spacing w:before="0" w:after="40"/>
       </w:pPr>
       <w:r>
-        <w:t>Structure: hidden content 'Instructor Notes Draft': body extraction skipped: files/hidden-instructor-notes.docx</w:t>
+        <w:t>Structure: hidden content 'Draft Quiz - Hidden': included as hidden/faculty-facing manifest link</w:t>
       </w:r>
     </w:p>
     <w:p>
@@ -2228,7 +2191,7 @@
         <w:spacing w:before="0" w:after="40"/>
       </w:pPr>
       <w:r>
-        <w:t>Structure: hidden content 'Hidden Faculty Setup Page': body extraction skipped: pages/hidden-faculty-setup.html</w:t>
+        <w:t>Structure: hidden content 'Instructor Notes Draft': preserved as hidden/faculty-facing file reference: files/hidden-instructor-notes.docx</w:t>
       </w:r>
     </w:p>
     <w:p>
@@ -2237,7 +2200,16 @@
         <w:spacing w:before="0" w:after="40"/>
       </w:pPr>
       <w:r>
-        <w:t>Structure: Package scope: hidden manifest-linked files skipped from blueprint body extraction: 2 file(s), 178 B total; by type: html: 1 / 140 B, document: 1 / 38 B; largest: pages/hidden-faculty-setup.html (140 B), files/hidden-instructor-notes.docx (38 B)</w:t>
+        <w:t>Structure: hidden content 'Hidden Faculty Setup Page': included as hidden/faculty-facing HTML body: pages/hidden-faculty-setup.html</w:t>
+      </w:r>
+    </w:p>
+    <w:p>
+      <w:pPr>
+        <w:pStyle w:val="ListBullet"/>
+        <w:spacing w:before="0" w:after="40"/>
+      </w:pPr>
+      <w:r>
+        <w:t>Structure: Package scope: hidden manifest-linked non-HTML files preserved as references: 1 file(s), 38 B total; by type: document: 1 / 38 B; largest: files/hidden-instructor-notes.docx (38 B)</w:t>
       </w:r>
     </w:p>
     <w:p>

</xml_diff>

<commit_message>
feat: render rubric DOCX artifacts
</commit_message>
<xml_diff>
--- a/examples/sample_course__blueprint_bundle/sample_course__blueprint.docx
+++ b/examples/sample_course__blueprint_bundle/sample_course__blueprint.docx
@@ -2160,6 +2160,484 @@
       </w:r>
     </w:p>
     <w:p>
+      <w:r>
+        <w:br w:type="page"/>
+      </w:r>
+    </w:p>
+    <w:p>
+      <w:pPr>
+        <w:pStyle w:val="Heading2"/>
+      </w:pPr>
+      <w:r>
+        <w:t>Rubric Appendix</w:t>
+      </w:r>
+    </w:p>
+    <w:p>
+      <w:r>
+        <w:rPr>
+          <w:color w:val="666666"/>
+          <w:sz w:val="16"/>
+        </w:rPr>
+        <w:t>Rubric grids are source-derived from rubrics_d2l.xml. Activity usage is listed when the export exposes a rubric association.</w:t>
+      </w:r>
+    </w:p>
+    <w:p>
+      <w:pPr>
+        <w:pStyle w:val="Heading3"/>
+      </w:pPr>
+      <w:r>
+        <w:t>Planning Memo Rubric</w:t>
+      </w:r>
+    </w:p>
+    <w:p>
+      <w:r>
+        <w:rPr>
+          <w:color w:val="666666"/>
+          <w:sz w:val="16"/>
+        </w:rPr>
+        <w:t>Rubric ID: RUB-1 | Resource code: RUBRIC-PLANNING-MEMO | Scoring method: 3</w:t>
+      </w:r>
+    </w:p>
+    <w:p>
+      <w:r>
+        <w:rPr>
+          <w:b/>
+        </w:rPr>
+        <w:t xml:space="preserve">Used by: </w:t>
+      </w:r>
+      <w:r>
+        <w:t>Assignment: Planning Memo</w:t>
+      </w:r>
+    </w:p>
+    <w:p>
+      <w:r>
+        <w:t>Rubric used to evaluate the planning memo.</w:t>
+      </w:r>
+    </w:p>
+    <w:tbl>
+      <w:tblPr>
+        <w:tblLook w:firstColumn="1" w:firstRow="1" w:lastColumn="0" w:lastRow="0" w:noHBand="0" w:noVBand="1" w:val="04A0"/>
+        <w:tblBorders>
+          <w:top w:val="single" w:sz="4" w:space="0" w:color="808080"/>
+          <w:left w:val="single" w:sz="4" w:space="0" w:color="808080"/>
+          <w:bottom w:val="single" w:sz="4" w:space="0" w:color="808080"/>
+          <w:right w:val="single" w:sz="4" w:space="0" w:color="808080"/>
+          <w:insideH w:val="single" w:sz="4" w:space="0" w:color="808080"/>
+          <w:insideV w:val="single" w:sz="4" w:space="0" w:color="808080"/>
+        </w:tblBorders>
+        <w:tblLayout w:type="fixed"/>
+        <w:tblCellMar>
+          <w:top w:w="70" w:type="dxa"/>
+          <w:start w:w="100" w:type="dxa"/>
+          <w:bottom w:w="70" w:type="dxa"/>
+          <w:end w:w="100" w:type="dxa"/>
+        </w:tblCellMar>
+        <w:tblW w:w="8640" w:type="dxa"/>
+      </w:tblPr>
+      <w:tblGrid>
+        <w:gridCol w:w="2419"/>
+        <w:gridCol w:w="3110"/>
+        <w:gridCol w:w="3110"/>
+      </w:tblGrid>
+      <w:tr>
+        <w:tc>
+          <w:tcPr>
+            <w:tcW w:w="2419" w:type="dxa"/>
+            <w:shd w:val="clear" w:color="auto" w:fill="F2F2F2"/>
+          </w:tcPr>
+          <w:p>
+            <w:pPr>
+              <w:spacing w:before="0" w:after="0"/>
+            </w:pPr>
+            <w:r>
+              <w:rPr>
+                <w:b/>
+                <w:sz w:val="18"/>
+              </w:rPr>
+              <w:t>Criterion</w:t>
+            </w:r>
+          </w:p>
+        </w:tc>
+        <w:tc>
+          <w:tcPr>
+            <w:tcW w:w="3110" w:type="dxa"/>
+            <w:shd w:val="clear" w:color="auto" w:fill="F2F2F2"/>
+          </w:tcPr>
+          <w:p>
+            <w:pPr>
+              <w:spacing w:before="0" w:after="0"/>
+            </w:pPr>
+            <w:r>
+              <w:rPr>
+                <w:b/>
+                <w:sz w:val="18"/>
+              </w:rPr>
+              <w:t>Achieving</w:t>
+              <w:br/>
+              <w:t>90%+</w:t>
+            </w:r>
+          </w:p>
+        </w:tc>
+        <w:tc>
+          <w:tcPr>
+            <w:tcW w:w="3110" w:type="dxa"/>
+            <w:shd w:val="clear" w:color="auto" w:fill="F2F2F2"/>
+          </w:tcPr>
+          <w:p>
+            <w:pPr>
+              <w:spacing w:before="0" w:after="0"/>
+            </w:pPr>
+            <w:r>
+              <w:rPr>
+                <w:b/>
+                <w:sz w:val="18"/>
+              </w:rPr>
+              <w:t>Developing</w:t>
+              <w:br/>
+              <w:t>50%+</w:t>
+            </w:r>
+          </w:p>
+        </w:tc>
+      </w:tr>
+      <w:tr>
+        <w:tc>
+          <w:tcPr>
+            <w:tcW w:w="2419" w:type="dxa"/>
+          </w:tcPr>
+          <w:p>
+            <w:pPr>
+              <w:spacing w:before="0" w:after="0"/>
+            </w:pPr>
+            <w:r>
+              <w:rPr>
+                <w:b/>
+                <w:sz w:val="18"/>
+              </w:rPr>
+              <w:t>Planning clarity</w:t>
+            </w:r>
+          </w:p>
+        </w:tc>
+        <w:tc>
+          <w:tcPr>
+            <w:tcW w:w="3110" w:type="dxa"/>
+          </w:tcPr>
+          <w:p>
+            <w:pPr>
+              <w:spacing w:before="0" w:after="0"/>
+            </w:pPr>
+            <w:r>
+              <w:rPr>
+                <w:b/>
+                <w:sz w:val="16"/>
+              </w:rPr>
+              <w:t>10 pts</w:t>
+            </w:r>
+            <w:r>
+              <w:br/>
+            </w:r>
+            <w:r>
+              <w:rPr>
+                <w:sz w:val="16"/>
+              </w:rPr>
+              <w:t>Explains the planning problem and next action clearly.</w:t>
+            </w:r>
+          </w:p>
+        </w:tc>
+        <w:tc>
+          <w:tcPr>
+            <w:tcW w:w="3110" w:type="dxa"/>
+          </w:tcPr>
+          <w:p>
+            <w:pPr>
+              <w:spacing w:before="0" w:after="0"/>
+            </w:pPr>
+            <w:r>
+              <w:rPr>
+                <w:b/>
+                <w:sz w:val="16"/>
+              </w:rPr>
+              <w:t>5 pts</w:t>
+            </w:r>
+            <w:r>
+              <w:br/>
+            </w:r>
+            <w:r>
+              <w:rPr>
+                <w:sz w:val="16"/>
+              </w:rPr>
+              <w:t>Identifies the planning problem but needs more actionable detail.</w:t>
+            </w:r>
+          </w:p>
+        </w:tc>
+      </w:tr>
+      <w:tr>
+        <w:tc>
+          <w:tcPr>
+            <w:tcW w:w="2419" w:type="dxa"/>
+          </w:tcPr>
+          <w:p>
+            <w:pPr>
+              <w:spacing w:before="0" w:after="0"/>
+            </w:pPr>
+            <w:r>
+              <w:rPr>
+                <w:b/>
+                <w:sz w:val="18"/>
+              </w:rPr>
+              <w:t>Evidence use</w:t>
+            </w:r>
+          </w:p>
+        </w:tc>
+        <w:tc>
+          <w:tcPr>
+            <w:tcW w:w="3110" w:type="dxa"/>
+          </w:tcPr>
+          <w:p>
+            <w:pPr>
+              <w:spacing w:before="0" w:after="0"/>
+            </w:pPr>
+            <w:r>
+              <w:rPr>
+                <w:b/>
+                <w:sz w:val="16"/>
+              </w:rPr>
+              <w:t>10 pts</w:t>
+            </w:r>
+            <w:r>
+              <w:br/>
+            </w:r>
+            <w:r>
+              <w:rPr>
+                <w:sz w:val="16"/>
+              </w:rPr>
+              <w:t>Uses course evidence to justify the recommendation.</w:t>
+            </w:r>
+          </w:p>
+        </w:tc>
+        <w:tc>
+          <w:tcPr>
+            <w:tcW w:w="3110" w:type="dxa"/>
+          </w:tcPr>
+          <w:p>
+            <w:pPr>
+              <w:spacing w:before="0" w:after="0"/>
+            </w:pPr>
+            <w:r>
+              <w:rPr>
+                <w:b/>
+                <w:sz w:val="16"/>
+              </w:rPr>
+              <w:t>5 pts</w:t>
+            </w:r>
+            <w:r>
+              <w:br/>
+            </w:r>
+            <w:r>
+              <w:rPr>
+                <w:sz w:val="16"/>
+              </w:rPr>
+              <w:t>References course evidence but does not fully connect it to the recommendation.</w:t>
+            </w:r>
+          </w:p>
+        </w:tc>
+      </w:tr>
+    </w:tbl>
+    <w:p/>
+    <w:p>
+      <w:pPr>
+        <w:spacing w:before="80" w:after="40"/>
+      </w:pPr>
+      <w:r>
+        <w:rPr>
+          <w:b/>
+        </w:rPr>
+        <w:t>Overall scoring bands</w:t>
+      </w:r>
+    </w:p>
+    <w:tbl>
+      <w:tblPr>
+        <w:tblLook w:firstColumn="1" w:firstRow="1" w:lastColumn="0" w:lastRow="0" w:noHBand="0" w:noVBand="1" w:val="04A0"/>
+        <w:tblBorders>
+          <w:top w:val="single" w:sz="4" w:space="0" w:color="808080"/>
+          <w:left w:val="single" w:sz="4" w:space="0" w:color="808080"/>
+          <w:bottom w:val="single" w:sz="4" w:space="0" w:color="808080"/>
+          <w:right w:val="single" w:sz="4" w:space="0" w:color="808080"/>
+          <w:insideH w:val="single" w:sz="4" w:space="0" w:color="808080"/>
+          <w:insideV w:val="single" w:sz="4" w:space="0" w:color="808080"/>
+        </w:tblBorders>
+        <w:tblLayout w:type="fixed"/>
+        <w:tblCellMar>
+          <w:top w:w="70" w:type="dxa"/>
+          <w:start w:w="100" w:type="dxa"/>
+          <w:bottom w:w="70" w:type="dxa"/>
+          <w:end w:w="100" w:type="dxa"/>
+        </w:tblCellMar>
+        <w:tblW w:w="8640" w:type="dxa"/>
+      </w:tblPr>
+      <w:tblGrid>
+        <w:gridCol w:w="2074"/>
+        <w:gridCol w:w="1555"/>
+        <w:gridCol w:w="5011"/>
+      </w:tblGrid>
+      <w:tr>
+        <w:tc>
+          <w:tcPr>
+            <w:tcW w:w="2074" w:type="dxa"/>
+            <w:shd w:val="clear" w:color="auto" w:fill="F2F2F2"/>
+          </w:tcPr>
+          <w:p>
+            <w:pPr>
+              <w:spacing w:before="0" w:after="0"/>
+            </w:pPr>
+            <w:r>
+              <w:rPr>
+                <w:b/>
+                <w:sz w:val="18"/>
+              </w:rPr>
+              <w:t>Band</w:t>
+            </w:r>
+          </w:p>
+        </w:tc>
+        <w:tc>
+          <w:tcPr>
+            <w:tcW w:w="1555" w:type="dxa"/>
+            <w:shd w:val="clear" w:color="auto" w:fill="F2F2F2"/>
+          </w:tcPr>
+          <w:p>
+            <w:pPr>
+              <w:spacing w:before="0" w:after="0"/>
+            </w:pPr>
+            <w:r>
+              <w:rPr>
+                <w:b/>
+                <w:sz w:val="18"/>
+              </w:rPr>
+              <w:t>Starts at</w:t>
+            </w:r>
+          </w:p>
+        </w:tc>
+        <w:tc>
+          <w:tcPr>
+            <w:tcW w:w="5011" w:type="dxa"/>
+            <w:shd w:val="clear" w:color="auto" w:fill="F2F2F2"/>
+          </w:tcPr>
+          <w:p>
+            <w:pPr>
+              <w:spacing w:before="0" w:after="0"/>
+            </w:pPr>
+            <w:r>
+              <w:rPr>
+                <w:b/>
+                <w:sz w:val="18"/>
+              </w:rPr>
+              <w:t>Description / feedback</w:t>
+            </w:r>
+          </w:p>
+        </w:tc>
+      </w:tr>
+      <w:tr>
+        <w:tc>
+          <w:tcPr>
+            <w:tcW w:w="2074" w:type="dxa"/>
+          </w:tcPr>
+          <w:p>
+            <w:pPr>
+              <w:spacing w:before="0" w:after="0"/>
+            </w:pPr>
+            <w:r>
+              <w:rPr>
+                <w:sz w:val="16"/>
+              </w:rPr>
+              <w:t>Achieving</w:t>
+            </w:r>
+          </w:p>
+        </w:tc>
+        <w:tc>
+          <w:tcPr>
+            <w:tcW w:w="1555" w:type="dxa"/>
+          </w:tcPr>
+          <w:p>
+            <w:pPr>
+              <w:spacing w:before="0" w:after="0"/>
+            </w:pPr>
+            <w:r>
+              <w:rPr>
+                <w:sz w:val="16"/>
+              </w:rPr>
+              <w:t>90</w:t>
+            </w:r>
+          </w:p>
+        </w:tc>
+        <w:tc>
+          <w:tcPr>
+            <w:tcW w:w="5011" w:type="dxa"/>
+          </w:tcPr>
+          <w:p>
+            <w:pPr>
+              <w:spacing w:before="0" w:after="0"/>
+            </w:pPr>
+            <w:r>
+              <w:rPr>
+                <w:sz w:val="16"/>
+              </w:rPr>
+              <w:t>Meets expectations.</w:t>
+            </w:r>
+          </w:p>
+        </w:tc>
+      </w:tr>
+      <w:tr>
+        <w:tc>
+          <w:tcPr>
+            <w:tcW w:w="2074" w:type="dxa"/>
+          </w:tcPr>
+          <w:p>
+            <w:pPr>
+              <w:spacing w:before="0" w:after="0"/>
+            </w:pPr>
+            <w:r>
+              <w:rPr>
+                <w:sz w:val="16"/>
+              </w:rPr>
+              <w:t>Developing</w:t>
+            </w:r>
+          </w:p>
+        </w:tc>
+        <w:tc>
+          <w:tcPr>
+            <w:tcW w:w="1555" w:type="dxa"/>
+          </w:tcPr>
+          <w:p>
+            <w:pPr>
+              <w:spacing w:before="0" w:after="0"/>
+            </w:pPr>
+            <w:r>
+              <w:rPr>
+                <w:sz w:val="16"/>
+              </w:rPr>
+              <w:t>50</w:t>
+            </w:r>
+          </w:p>
+        </w:tc>
+        <w:tc>
+          <w:tcPr>
+            <w:tcW w:w="5011" w:type="dxa"/>
+          </w:tcPr>
+          <w:p>
+            <w:pPr>
+              <w:spacing w:before="0" w:after="0"/>
+            </w:pPr>
+            <w:r>
+              <w:rPr>
+                <w:sz w:val="16"/>
+              </w:rPr>
+              <w:t>Partially meets expectations.</w:t>
+            </w:r>
+          </w:p>
+        </w:tc>
+      </w:tr>
+    </w:tbl>
+    <w:p/>
+    <w:p>
       <w:pPr>
         <w:pStyle w:val="Heading2"/>
       </w:pPr>

</xml_diff>